<commit_message>
fix(auth): corrige o texto e o comentário sobre o limite de envio
Os dois foram escritos quando o projeto ainda usava o SMTP nativo do
Supabase, que entrega poucas mensagens por hora. Desde que o envio passou
para servidor próprio, ficaram errados.

O comentário atribuía o erro 429 ao provedor de email. Ele vem do próprio
Auth, que limita o excesso de pedidos independentemente de quem entrega a
mensagem, só que com folga bem maior quando há SMTP próprio.

O aviso na tela mandava esperar trinta minutos e culpava o servidor de
email. Agora pede alguns minutos e não atribui a causa a quem não tem
culpa.

Na bateria de testes, o T13 pedia para disparar o limite com três ou
quatro tentativas, o que não acontece mais no volume atual. Quem rodasse
o roteiro veria o teste falhar sem nada estar quebrado. Reescrito para
validar o que interessa: que pedido repetido não trava a interface nem
mostra erro técnico.
</commit_message>
<xml_diff>
--- a/docs/Ecoverse - Bateria de testes.docx
+++ b/docs/Ecoverse - Bateria de testes.docx
@@ -1376,7 +1376,7 @@
           <w:sz w:val="23"/>
           <w:szCs w:val="23"/>
         </w:rPr>
-        <w:t xml:space="preserve">T13. Limite de envio de email</w:t>
+        <w:t xml:space="preserve">T13. Pedidos repetidos do link</w:t>
       </w:r>
     </w:p>
     <w:p>
@@ -1399,7 +1399,7 @@
           <w:sz w:val="22"/>
           <w:szCs w:val="22"/>
         </w:rPr>
-        <w:t xml:space="preserve">Se o sistema avisa com clareza quando o provedor recusa por excesso de tentativas.</w:t>
+        <w:t xml:space="preserve">Se o sistema trata um pedido repetido sem travar e sem mostrar erro técnico.</w:t>
       </w:r>
     </w:p>
     <w:p>
@@ -1422,7 +1422,7 @@
           <w:sz w:val="22"/>
           <w:szCs w:val="22"/>
         </w:rPr>
-        <w:t xml:space="preserve">Peça o link três ou quatro vezes seguidas, em menos de uma hora.</w:t>
+        <w:t xml:space="preserve">Peça o link duas ou três vezes seguidas para o mesmo email, com poucos minutos de intervalo.</w:t>
       </w:r>
     </w:p>
     <w:p>
@@ -1445,7 +1445,7 @@
           <w:sz w:val="22"/>
           <w:szCs w:val="22"/>
         </w:rPr>
-        <w:t xml:space="preserve">Em algum momento aparece um aviso explicando que o limite por hora foi atingido e pedindo para aguardar. O sistema não pode travar nem mostrar erro técnico. Este comportamento é esperado e está detalhado na seção de pontos de atenção do documento de transferência.</w:t>
+        <w:t xml:space="preserve">Os links chegam normalmente. Caso o servidor recuse por excesso de tentativas, o que é raro no volume de uma turma, aparece um aviso pedindo para aguardar alguns minutos. Em nenhuma hipótese o botão pode ficar travado ou surgir mensagem técnica na tela.</w:t>
       </w:r>
     </w:p>
     <w:p>
@@ -2797,7 +2797,7 @@
           <w:sz w:val="22"/>
           <w:szCs w:val="22"/>
         </w:rPr>
-        <w:t xml:space="preserve">Confira a caixa de spam. Se várias pessoas tentaram entrar na mesma hora, é o limite de envio do plano gratuito. Veja o teste T13.</w:t>
+        <w:t xml:space="preserve">Confira a caixa de spam e a lixeira. Se não estiver em nenhum dos dois, veja no painel do serviço de envio se a mensagem consta como entregue. O passo a passo está no manual do banco, no repositório.</w:t>
       </w:r>
     </w:p>
     <w:p>

</xml_diff>